<commit_message>
BASEF Final Stage 1st Commit
</commit_message>
<xml_diff>
--- a/public/Documents/WattWizards - ISEF 2025 - Abstract.docx
+++ b/public/Documents/WattWizards - ISEF 2025 - Abstract.docx
@@ -143,7 +143,39 @@
           <w:sz w:val="32"/>
           <w:szCs w:val="32"/>
         </w:rPr>
-        <w:t xml:space="preserve"> and incorporates features like workspaces and inventory management. </w:t>
+        <w:t xml:space="preserve"> and incorp</w:t>
+      </w:r>
+      <w:r>
+        <w:rPr>
+          <w:rFonts w:ascii="Times New Roman" w:eastAsia="Times New Roman" w:hAnsi="Times New Roman" w:cs="Times New Roman"/>
+          <w:sz w:val="32"/>
+          <w:szCs w:val="32"/>
+        </w:rPr>
+        <w:t xml:space="preserve">orates features like online/offline workspaces, </w:t>
+      </w:r>
+      <w:r>
+        <w:rPr>
+          <w:rFonts w:ascii="Times New Roman" w:eastAsia="Times New Roman" w:hAnsi="Times New Roman" w:cs="Times New Roman"/>
+          <w:sz w:val="32"/>
+          <w:szCs w:val="32"/>
+        </w:rPr>
+        <w:t>inventory</w:t>
+      </w:r>
+      <w:r>
+        <w:rPr>
+          <w:rFonts w:ascii="Times New Roman" w:eastAsia="Times New Roman" w:hAnsi="Times New Roman" w:cs="Times New Roman"/>
+          <w:sz w:val="32"/>
+          <w:szCs w:val="32"/>
+        </w:rPr>
+        <w:t xml:space="preserve"> and project</w:t>
+      </w:r>
+      <w:r>
+        <w:rPr>
+          <w:rFonts w:ascii="Times New Roman" w:eastAsia="Times New Roman" w:hAnsi="Times New Roman" w:cs="Times New Roman"/>
+          <w:sz w:val="32"/>
+          <w:szCs w:val="32"/>
+        </w:rPr>
+        <w:t xml:space="preserve"> management. </w:t>
       </w:r>
     </w:p>
     <w:p>
@@ -172,7 +204,39 @@
           <w:szCs w:val="32"/>
         </w:rPr>
         <w:br/>
-        <w:t>The development of WattWizards followed a structured multi-phase approach. Initially, an Excel-based tool was employed but proved inadequate for complex tasks, prompting the creation of a Python desktop application with a GUI using CustomTkinter. To improve scalability and user accessibility, the project transitioned to a web application utilizing Html5, Css3, and JavaScript.</w:t>
+        <w:t>The development of WattWizards followed a structured multi-phase approach. Initially, an Excel-based tool was employed but proved inadequate for complex tasks, prompting the creation of a Python desk</w:t>
+      </w:r>
+      <w:r>
+        <w:rPr>
+          <w:rFonts w:ascii="Times New Roman" w:eastAsia="Times New Roman" w:hAnsi="Times New Roman" w:cs="Times New Roman"/>
+          <w:sz w:val="32"/>
+          <w:szCs w:val="32"/>
+        </w:rPr>
+        <w:t>top application with a GUI</w:t>
+      </w:r>
+      <w:r>
+        <w:rPr>
+          <w:rFonts w:ascii="Times New Roman" w:eastAsia="Times New Roman" w:hAnsi="Times New Roman" w:cs="Times New Roman"/>
+          <w:sz w:val="32"/>
+          <w:szCs w:val="32"/>
+        </w:rPr>
+        <w:t>. To improve scalability and user accessibility, th</w:t>
+      </w:r>
+      <w:r>
+        <w:rPr>
+          <w:rFonts w:ascii="Times New Roman" w:eastAsia="Times New Roman" w:hAnsi="Times New Roman" w:cs="Times New Roman"/>
+          <w:sz w:val="32"/>
+          <w:szCs w:val="32"/>
+        </w:rPr>
+        <w:t xml:space="preserve">e project transitioned to a website </w:t>
+      </w:r>
+      <w:r>
+        <w:rPr>
+          <w:rFonts w:ascii="Times New Roman" w:eastAsia="Times New Roman" w:hAnsi="Times New Roman" w:cs="Times New Roman"/>
+          <w:sz w:val="32"/>
+          <w:szCs w:val="32"/>
+        </w:rPr>
+        <w:t>utilizing Html5, Css3, and JavaScript.</w:t>
       </w:r>
     </w:p>
     <w:p>
@@ -190,7 +254,23 @@
           <w:sz w:val="32"/>
           <w:szCs w:val="32"/>
         </w:rPr>
-        <w:t>The final iteration was developed as a React.js platform integrated with Node.js, Express.js, PHP, and Laravel for microservices and backend improvements. MySQL ensured efficient data handling.</w:t>
+        <w:t>The final iteration was developed as a React.js platform integ</w:t>
+      </w:r>
+      <w:r>
+        <w:rPr>
+          <w:rFonts w:ascii="Times New Roman" w:eastAsia="Times New Roman" w:hAnsi="Times New Roman" w:cs="Times New Roman"/>
+          <w:sz w:val="32"/>
+          <w:szCs w:val="32"/>
+        </w:rPr>
+        <w:t>rated with Node.js, Express.js,</w:t>
+      </w:r>
+      <w:r>
+        <w:rPr>
+          <w:rFonts w:ascii="Times New Roman" w:eastAsia="Times New Roman" w:hAnsi="Times New Roman" w:cs="Times New Roman"/>
+          <w:sz w:val="32"/>
+          <w:szCs w:val="32"/>
+        </w:rPr>
+        <w:t xml:space="preserve"> and Laravel for microservices and backend improvements. MySQL ensured efficient data handling.</w:t>
       </w:r>
     </w:p>
     <w:p>
@@ -219,7 +299,35 @@
           <w:szCs w:val="32"/>
         </w:rPr>
         <w:br/>
-        <w:t>Surveys revealed a strong demand for an accurate, user-friendly tool, guiding the platform’s design. WattWizards demonstrates potential to revolutionize workflows in industrial and educational applications.</w:t>
+        <w:t>Surveys revealed a strong demand for an accurate, use</w:t>
+      </w:r>
+      <w:bookmarkStart w:id="0" w:name="_GoBack"/>
+      <w:bookmarkEnd w:id="0"/>
+      <w:r>
+        <w:rPr>
+          <w:rFonts w:ascii="Times New Roman" w:eastAsia="Times New Roman" w:hAnsi="Times New Roman" w:cs="Times New Roman"/>
+          <w:sz w:val="32"/>
+          <w:szCs w:val="32"/>
+        </w:rPr>
+        <w:t xml:space="preserve">r-friendly tool, guiding the platform’s design. </w:t>
+      </w:r>
+      <w:r>
+        <w:rPr>
+          <w:rFonts w:ascii="Times New Roman" w:eastAsia="Times New Roman" w:hAnsi="Times New Roman" w:cs="Times New Roman"/>
+          <w:b/>
+          <w:bCs/>
+          <w:sz w:val="32"/>
+          <w:szCs w:val="32"/>
+        </w:rPr>
+        <w:t>WattWizards</w:t>
+      </w:r>
+      <w:r>
+        <w:rPr>
+          <w:rFonts w:ascii="Times New Roman" w:eastAsia="Times New Roman" w:hAnsi="Times New Roman" w:cs="Times New Roman"/>
+          <w:sz w:val="32"/>
+          <w:szCs w:val="32"/>
+        </w:rPr>
+        <w:t xml:space="preserve"> demonstrates potential to revolutionize workflows in industrial and educational applications.</w:t>
       </w:r>
     </w:p>
     <w:p>
@@ -335,7 +443,6 @@
           <w:szCs w:val="32"/>
         </w:rPr>
       </w:pPr>
-      <w:bookmarkStart w:id="0" w:name="_GoBack"/>
       <w:r>
         <w:rPr>
           <w:rFonts w:ascii="Times New Roman" w:eastAsia="Times New Roman" w:hAnsi="Times New Roman" w:cs="Times New Roman"/>
@@ -344,31 +451,8 @@
           <w:sz w:val="32"/>
           <w:szCs w:val="32"/>
         </w:rPr>
-        <w:t>Power Cables - Al-</w:t>
-      </w:r>
-      <w:proofErr w:type="spellStart"/>
-      <w:r>
-        <w:rPr>
-          <w:rFonts w:ascii="Times New Roman" w:eastAsia="Times New Roman" w:hAnsi="Times New Roman" w:cs="Times New Roman"/>
-          <w:b/>
-          <w:bCs/>
-          <w:sz w:val="32"/>
-          <w:szCs w:val="32"/>
-        </w:rPr>
-        <w:t>Suwaidi</w:t>
-      </w:r>
-      <w:proofErr w:type="spellEnd"/>
-      <w:r>
-        <w:rPr>
-          <w:rFonts w:ascii="Times New Roman" w:eastAsia="Times New Roman" w:hAnsi="Times New Roman" w:cs="Times New Roman"/>
-          <w:b/>
-          <w:bCs/>
-          <w:sz w:val="32"/>
-          <w:szCs w:val="32"/>
-        </w:rPr>
-        <w:t xml:space="preserve"> Catalogue.</w:t>
-      </w:r>
-      <w:bookmarkEnd w:id="0"/>
+        <w:t>Power Cables - Al-Suwaidi Catalogue.</w:t>
+      </w:r>
     </w:p>
     <w:sectPr>
       <w:pgSz w:w="12240" w:h="15840"/>

</xml_diff>